<commit_message>
Fix sidebar alignment, sidebar truthfulness, empty managerial section
</commit_message>
<xml_diff>
--- a/public/templates/internal.docx
+++ b/public/templates/internal.docx
@@ -822,6 +822,11 @@
             </w:r>
           </w:p>
           <w:p>
+            <w:r>
+              <w:t xml:space="preserve">{#hasManagerialExperience}</w:t>
+            </w:r>
+          </w:p>
+          <w:p>
             <w:pPr>
               <w:pStyle w:val="Heading1"/>
               <w:jc w:val="left"/>
@@ -857,6 +862,11 @@
           <w:p>
             <w:r>
               <w:t xml:space="preserve">{/managerialExperience}</w:t>
+            </w:r>
+          </w:p>
+          <w:p>
+            <w:r>
+              <w:t xml:space="preserve">{/hasManagerialExperience}</w:t>
             </w:r>
           </w:p>
           <w:p>
@@ -1243,10 +1253,11 @@
     <w:lvl w:ilvl="0">
       <w:start w:val="1"/>
       <w:numFmt w:val="bullet"/>
+      <w:suff w:val="nothing"/>
       <w:lvlText w:val="​"/>
       <w:lvlJc w:val="left"/>
       <w:pPr>
-        <w:ind w:left="720" w:hanging="360"/>
+        <w:ind w:left="0" w:hanging="0"/>
       </w:pPr>
       <w:rPr>
         <w:u w:val="none"/>

</xml_diff>

<commit_message>
Internal template: add the missing spacer after the Managerial Experience block
One blank paragraph inside {#hasManagerialExperience} (scripts/patch-optional-sections.py SPACERS), so the items no
longer run into the next sidebar heading and the spacer disappears with the section. test-render.mjs asserts it owns
exactly one blank paragraph and sits before the Domain heading; checked in LibreOffice PDFs (full, mixed, bare).
</commit_message>
<xml_diff>
--- a/public/templates/internal.docx
+++ b/public/templates/internal.docx
@@ -932,6 +932,19 @@
           <w:p>
             <w:r>
               <w:t xml:space="preserve">{/managerialExperience}</w:t>
+            </w:r>
+          </w:p>
+          <w:p>
+            <w:pPr>
+              <w:jc w:val="left"/>
+              <w:rPr>
+                <w:color w:val="231f20"/>
+              </w:rPr>
+            </w:pPr>
+            <w:r>
+              <w:rPr>
+                <w:rtl w:val="0"/>
+              </w:rPr>
             </w:r>
           </w:p>
           <w:p>

</xml_diff>

<commit_message>
Templates: sidebar 1.15 inside an item, 1.5 between items; no stretched last lines
Internal sidebar (Skills, Certifications, Tools, Managerial Experience, Domain,
Languages): 1.15 line spacing inside an item (a skill = name + rating, or one
entry that wraps) and 1.5 lines from one item to the next (4.8pt after each
item; one line of 11pt Lexend is 13.75pt). The blank paragraph after every
skill is gone; Skills ends with one section spacer like the other sections.

settings.xml gets doNotExpandShiftReturn: the overview and qualification
paragraphs end in a manual line break, and Word / LibreOffice stretched that
last justified line across the column (Google Docs never did).

test:render: on the PDFs, every sidebar item's lines are 1.15 apart and items
1.5 apart; the XML check covers doNotExpandShiftReturn.

Co-Authored-By: Claude Opus 5.5 <noreply@anthropic.com>
</commit_message>
<xml_diff>
--- a/public/templates/internal.docx
+++ b/public/templates/internal.docx
@@ -727,6 +727,7 @@
           <w:p>
             <w:pPr>
               <w:pStyle w:val="Heading2"/>
+              <w:spacing w:before="0" w:after="0" w:line="276" w:lineRule="auto"/>
               <w:jc w:val="left"/>
               <w:rPr/>
             </w:pPr>
@@ -741,6 +742,7 @@
           </w:p>
           <w:p>
             <w:pPr>
+              <w:spacing w:before="0" w:after="96" w:line="276" w:lineRule="auto"/>
               <w:jc w:val="left"/>
               <w:rPr/>
             </w:pPr>
@@ -752,26 +754,21 @@
             </w:r>
           </w:p>
           <w:p>
-            <w:pPr>
-              <w:pageBreakBefore w:val="0"/>
-              <w:spacing w:before="0" w:line="276" w:lineRule="auto"/>
-              <w:ind w:right="300"/>
+            <w:r>
+              <w:t xml:space="preserve">{/skills}</w:t>
+            </w:r>
+          </w:p>
+          <w:p>
+            <w:pPr>
               <w:jc w:val="left"/>
               <w:rPr>
-                <w:rFonts w:ascii="Lexend Light" w:cs="Lexend Light" w:eastAsia="Lexend Light" w:hAnsi="Lexend Light"/>
-                <w:sz w:val="22"/>
-                <w:szCs w:val="22"/>
-              </w:rPr>
-            </w:pPr>
-            <w:r>
-              <w:rPr>
-                <w:rtl w:val="0"/>
-              </w:rPr>
-            </w:r>
-          </w:p>
-          <w:p>
-            <w:r>
-              <w:t xml:space="preserve">{/skills}</w:t>
+                <w:color w:val="231f20"/>
+              </w:rPr>
+            </w:pPr>
+            <w:r>
+              <w:rPr>
+                <w:rtl w:val="0"/>
+              </w:rPr>
             </w:r>
           </w:p>
           <w:p>
@@ -805,6 +802,7 @@
                 <w:ilvl w:val="0"/>
                 <w:numId w:val="2"/>
               </w:numPr>
+              <w:spacing w:before="0" w:after="96" w:line="276" w:lineRule="auto"/>
               <w:jc w:val="left"/>
               <w:rPr>
                 <w:color w:val="231f20"/>
@@ -861,6 +859,34 @@
                 <w:rtl w:val="0"/>
               </w:rPr>
               <w:t xml:space="preserve">Tools</w:t>
+            </w:r>
+          </w:p>
+          <w:p>
+            <w:pPr>
+              <w:pageBreakBefore w:val="0"/>
+              <w:numPr>
+                <w:ilvl w:val="0"/>
+                <w:numId w:val="2"/>
+              </w:numPr>
+              <w:spacing w:before="0" w:after="96" w:line="276" w:lineRule="auto"/>
+              <w:ind w:right="300"/>
+              <w:jc w:val="left"/>
+              <w:rPr>
+                <w:rFonts w:ascii="Lexend Light" w:cs="Lexend Light" w:eastAsia="Lexend Light" w:hAnsi="Lexend Light"/>
+                <w:color w:val="231f20"/>
+                <w:sz w:val="22"/>
+                <w:szCs w:val="22"/>
+              </w:rPr>
+            </w:pPr>
+            <w:r>
+              <w:rPr>
+                <w:rFonts w:ascii="Lexend Light" w:cs="Lexend Light" w:eastAsia="Lexend Light" w:hAnsi="Lexend Light"/>
+                <w:color w:val="231f20"/>
+                <w:sz w:val="22"/>
+                <w:szCs w:val="22"/>
+                <w:rtl w:val="0"/>
+              </w:rPr>
+              <w:t xml:space="preserve">{tools}</w:t>
             </w:r>
           </w:p>
           <w:p>
@@ -874,20 +900,124 @@
               <w:jc w:val="left"/>
               <w:rPr>
                 <w:rFonts w:ascii="Lexend Light" w:cs="Lexend Light" w:eastAsia="Lexend Light" w:hAnsi="Lexend Light"/>
-                <w:color w:val="231f20"/>
                 <w:sz w:val="22"/>
                 <w:szCs w:val="22"/>
               </w:rPr>
             </w:pPr>
             <w:r>
               <w:rPr>
-                <w:rFonts w:ascii="Lexend Light" w:cs="Lexend Light" w:eastAsia="Lexend Light" w:hAnsi="Lexend Light"/>
+                <w:rtl w:val="0"/>
+              </w:rPr>
+            </w:r>
+          </w:p>
+          <w:p>
+            <w:r>
+              <w:t xml:space="preserve">{/hasTools}</w:t>
+            </w:r>
+          </w:p>
+          <w:p>
+            <w:r>
+              <w:t xml:space="preserve">{#hasManagerialExperience}</w:t>
+            </w:r>
+          </w:p>
+          <w:p>
+            <w:pPr>
+              <w:pStyle w:val="Heading1"/>
+              <w:jc w:val="left"/>
+              <w:rPr/>
+            </w:pPr>
+            <w:bookmarkStart w:colFirst="0" w:colLast="0" w:name="_6ss1ldcg9sb" w:id="37"/>
+            <w:bookmarkEnd w:id="37"/>
+            <w:r>
+              <w:rPr>
+                <w:rtl w:val="0"/>
+              </w:rPr>
+              <w:t xml:space="preserve">Managerial Experience</w:t>
+            </w:r>
+          </w:p>
+          <w:p>
+            <w:r>
+              <w:t xml:space="preserve">{#managerialExperience}</w:t>
+            </w:r>
+          </w:p>
+          <w:p>
+            <w:pPr>
+              <w:spacing w:before="0" w:after="96" w:line="276" w:lineRule="auto"/>
+              <w:jc w:val="left"/>
+              <w:rPr/>
+            </w:pPr>
+            <w:r>
+              <w:rPr>
+                <w:rtl w:val="0"/>
+              </w:rPr>
+              <w:t xml:space="preserve">{.}</w:t>
+            </w:r>
+          </w:p>
+          <w:p>
+            <w:r>
+              <w:t xml:space="preserve">{/managerialExperience}</w:t>
+            </w:r>
+          </w:p>
+          <w:p>
+            <w:pPr>
+              <w:jc w:val="left"/>
+              <w:rPr>
                 <w:color w:val="231f20"/>
-                <w:sz w:val="22"/>
-                <w:szCs w:val="22"/>
-                <w:rtl w:val="0"/>
-              </w:rPr>
-              <w:t xml:space="preserve">{tools}</w:t>
+              </w:rPr>
+            </w:pPr>
+            <w:r>
+              <w:rPr>
+                <w:rtl w:val="0"/>
+              </w:rPr>
+            </w:r>
+          </w:p>
+          <w:p>
+            <w:r>
+              <w:t xml:space="preserve">{/hasManagerialExperience}</w:t>
+            </w:r>
+          </w:p>
+          <w:p>
+            <w:r>
+              <w:t xml:space="preserve">{#hasDomains}</w:t>
+            </w:r>
+          </w:p>
+          <w:p>
+            <w:pPr>
+              <w:pStyle w:val="Heading1"/>
+              <w:jc w:val="left"/>
+              <w:rPr/>
+            </w:pPr>
+            <w:bookmarkStart w:colFirst="0" w:colLast="0" w:name="_jheiv7ka0yr2" w:id="39"/>
+            <w:bookmarkEnd w:id="39"/>
+            <w:r>
+              <w:rPr>
+                <w:rtl w:val="0"/>
+              </w:rPr>
+              <w:t xml:space="preserve">Domain</w:t>
+            </w:r>
+          </w:p>
+          <w:p>
+            <w:r>
+              <w:t xml:space="preserve">{#domains}</w:t>
+            </w:r>
+          </w:p>
+          <w:p>
+            <w:pPr>
+              <w:spacing w:before="0" w:after="96" w:line="276" w:lineRule="auto"/>
+              <w:ind w:left="0" w:firstLine="0"/>
+              <w:jc w:val="left"/>
+              <w:rPr/>
+            </w:pPr>
+            <w:r>
+              <w:rPr>
+                <w:rtl w:val="0"/>
+              </w:rPr>
+              <w:t xml:space="preserve">{.}</w:t>
+            </w:r>
+          </w:p>
+          <w:p>
+            <w:r>
+              <w:t xml:space="preserve">{/domains}</w:t>
             </w:r>
           </w:p>
           <w:p>
@@ -901,137 +1031,6 @@
               <w:jc w:val="left"/>
               <w:rPr>
                 <w:rFonts w:ascii="Lexend Light" w:cs="Lexend Light" w:eastAsia="Lexend Light" w:hAnsi="Lexend Light"/>
-                <w:sz w:val="22"/>
-                <w:szCs w:val="22"/>
-              </w:rPr>
-            </w:pPr>
-            <w:r>
-              <w:rPr>
-                <w:rtl w:val="0"/>
-              </w:rPr>
-            </w:r>
-          </w:p>
-          <w:p>
-            <w:r>
-              <w:t xml:space="preserve">{/hasTools}</w:t>
-            </w:r>
-          </w:p>
-          <w:p>
-            <w:r>
-              <w:t xml:space="preserve">{#hasManagerialExperience}</w:t>
-            </w:r>
-          </w:p>
-          <w:p>
-            <w:pPr>
-              <w:pStyle w:val="Heading1"/>
-              <w:jc w:val="left"/>
-              <w:rPr/>
-            </w:pPr>
-            <w:bookmarkStart w:colFirst="0" w:colLast="0" w:name="_6ss1ldcg9sb" w:id="37"/>
-            <w:bookmarkEnd w:id="37"/>
-            <w:r>
-              <w:rPr>
-                <w:rtl w:val="0"/>
-              </w:rPr>
-              <w:t xml:space="preserve">Managerial Experience</w:t>
-            </w:r>
-          </w:p>
-          <w:p>
-            <w:r>
-              <w:t xml:space="preserve">{#managerialExperience}</w:t>
-            </w:r>
-          </w:p>
-          <w:p>
-            <w:pPr>
-              <w:spacing w:line="312" w:lineRule="auto"/>
-              <w:jc w:val="left"/>
-              <w:rPr/>
-            </w:pPr>
-            <w:r>
-              <w:rPr>
-                <w:rtl w:val="0"/>
-              </w:rPr>
-              <w:t xml:space="preserve">{.}</w:t>
-            </w:r>
-          </w:p>
-          <w:p>
-            <w:r>
-              <w:t xml:space="preserve">{/managerialExperience}</w:t>
-            </w:r>
-          </w:p>
-          <w:p>
-            <w:pPr>
-              <w:jc w:val="left"/>
-              <w:rPr>
-                <w:color w:val="231f20"/>
-              </w:rPr>
-            </w:pPr>
-            <w:r>
-              <w:rPr>
-                <w:rtl w:val="0"/>
-              </w:rPr>
-            </w:r>
-          </w:p>
-          <w:p>
-            <w:r>
-              <w:t xml:space="preserve">{/hasManagerialExperience}</w:t>
-            </w:r>
-          </w:p>
-          <w:p>
-            <w:r>
-              <w:t xml:space="preserve">{#hasDomains}</w:t>
-            </w:r>
-          </w:p>
-          <w:p>
-            <w:pPr>
-              <w:pStyle w:val="Heading1"/>
-              <w:jc w:val="left"/>
-              <w:rPr/>
-            </w:pPr>
-            <w:bookmarkStart w:colFirst="0" w:colLast="0" w:name="_jheiv7ka0yr2" w:id="39"/>
-            <w:bookmarkEnd w:id="39"/>
-            <w:r>
-              <w:rPr>
-                <w:rtl w:val="0"/>
-              </w:rPr>
-              <w:t xml:space="preserve">Domain</w:t>
-            </w:r>
-          </w:p>
-          <w:p>
-            <w:r>
-              <w:t xml:space="preserve">{#domains}</w:t>
-            </w:r>
-          </w:p>
-          <w:p>
-            <w:pPr>
-              <w:spacing w:line="312" w:lineRule="auto"/>
-              <w:ind w:left="0" w:firstLine="0"/>
-              <w:jc w:val="left"/>
-              <w:rPr/>
-            </w:pPr>
-            <w:r>
-              <w:rPr>
-                <w:rtl w:val="0"/>
-              </w:rPr>
-              <w:t xml:space="preserve">{.}</w:t>
-            </w:r>
-          </w:p>
-          <w:p>
-            <w:r>
-              <w:t xml:space="preserve">{/domains}</w:t>
-            </w:r>
-          </w:p>
-          <w:p>
-            <w:pPr>
-              <w:pageBreakBefore w:val="0"/>
-              <w:numPr>
-                <w:ilvl w:val="0"/>
-                <w:numId w:val="2"/>
-              </w:numPr>
-              <w:ind w:right="300"/>
-              <w:jc w:val="left"/>
-              <w:rPr>
-                <w:rFonts w:ascii="Lexend Light" w:cs="Lexend Light" w:eastAsia="Lexend Light" w:hAnsi="Lexend Light"/>
               </w:rPr>
             </w:pPr>
             <w:r>
@@ -1073,7 +1072,7 @@
           </w:p>
           <w:p>
             <w:pPr>
-              <w:spacing w:line="312" w:lineRule="auto"/>
+              <w:spacing w:before="0" w:after="96" w:line="276" w:lineRule="auto"/>
               <w:jc w:val="left"/>
               <w:rPr/>
             </w:pPr>

</xml_diff>

<commit_message>
Internal PDF: no extra near-empty last page
The blank line that ends each project in the loop was also emitted after the LAST project, as a trailing empty
line in the projects cell. When the last bullet sat at the foot of a page, that line alone spilled onto a new page
showing only the footer (logo and page number). patch-templates.py now wraps it in {#hasNext} (set in prepareData),
so it only separates one project from the next. test:render checks the cell's end and, with --pdf, sweeps the last
bullet across the page foot and asserts the last page has content.

Co-Authored-By: Claude Opus 5.5 <noreply@anthropic.com>
</commit_message>
<xml_diff>
--- a/public/templates/internal.docx
+++ b/public/templates/internal.docx
@@ -678,7 +678,17 @@
           </w:p>
           <w:p>
             <w:r>
+              <w:t xml:space="preserve">{#hasNext}</w:t>
+            </w:r>
+          </w:p>
+          <w:p>
+            <w:r>
               <w:t xml:space="preserve"/>
+            </w:r>
+          </w:p>
+          <w:p>
+            <w:r>
+              <w:t xml:space="preserve">{/hasNext}</w:t>
             </w:r>
           </w:p>
           <w:p>

</xml_diff>

<commit_message>
Internal template: grey line under the header and underlined project headings
Both as in eval/reference/format.pdf:
- the thin line under the header block: #888888, 1.0pt (LW 1.333 at 0.75
  scale), x 54.0 to 541.0, centred at y 146.5. It is the bottom border of an
  empty paragraph; an empty experience or specialisation line leaves a blank
  line of its own height, so the line stays put whatever the header holds.
- the whole "Project N - <dates>" line underlined (single, text colour).
  LibreOffice draws the underline at the font's own thickness (0.7pt, 1.2pt
  below the baseline) where the reference has 1.0pt, 1.4pt below.

pdf-measure.mjs now reports drawn lines (colour, width, extent); test:render
--pdf checks both on every internal render (and that external has neither).

Co-Authored-By: Claude Sonnet 5.5 <noreply@anthropic.com>
</commit_message>
<xml_diff>
--- a/public/templates/internal.docx
+++ b/public/templates/internal.docx
@@ -231,6 +231,22 @@
           </w:p>
           <w:p>
             <w:r>
+              <w:t xml:space="preserve">{^hasExperienceSummary}</w:t>
+            </w:r>
+          </w:p>
+          <w:p>
+            <w:pPr>
+              <w:spacing w:before="0" w:after="0" w:line="332" w:lineRule="exact"/>
+              <w:jc w:val="left"/>
+            </w:pPr>
+          </w:p>
+          <w:p>
+            <w:r>
+              <w:t xml:space="preserve">{/hasExperienceSummary}</w:t>
+            </w:r>
+          </w:p>
+          <w:p>
+            <w:r>
               <w:t xml:space="preserve">{#hasSpecialization}</w:t>
             </w:r>
           </w:p>
@@ -263,6 +279,32 @@
             <w:r>
               <w:t xml:space="preserve">{/hasSpecialization}</w:t>
             </w:r>
+          </w:p>
+          <w:p>
+            <w:r>
+              <w:t xml:space="preserve">{^hasSpecialization}</w:t>
+            </w:r>
+          </w:p>
+          <w:p>
+            <w:pPr>
+              <w:spacing w:before="0" w:after="0" w:line="348" w:lineRule="exact"/>
+              <w:jc w:val="left"/>
+            </w:pPr>
+          </w:p>
+          <w:p>
+            <w:r>
+              <w:t xml:space="preserve">{/hasSpecialization}</w:t>
+            </w:r>
+          </w:p>
+          <w:p>
+            <w:pPr>
+              <w:pBdr>
+                <w:bottom w:val="single" w:sz="8" w:space="0" w:color="888888"/>
+              </w:pBdr>
+              <w:spacing w:before="0" w:after="0" w:line="154" w:lineRule="exact"/>
+              <w:ind w:left="66" w:right="376" w:firstLine="0"/>
+              <w:jc w:val="left"/>
+            </w:pPr>
           </w:p>
         </w:tc>
       </w:tr>
@@ -498,6 +540,7 @@
                 <w:color w:val="373742"/>
                 <w:sz w:val="22"/>
                 <w:szCs w:val="22"/>
+                <w:u w:val="single"/>
               </w:rPr>
             </w:pPr>
             <w:bookmarkStart w:colFirst="0" w:colLast="0" w:name="_gfiut3vv9g0y" w:id="7"/>
@@ -510,6 +553,7 @@
                 <w:color w:val="373742"/>
                 <w:sz w:val="22"/>
                 <w:szCs w:val="22"/>
+                <w:u w:val="single"/>
                 <w:rtl w:val="0"/>
               </w:rPr>
               <w:t xml:space="preserve">Project {number}{#hasDuration} - {duration}{/hasDuration}</w:t>

</xml_diff>

<commit_message>
Internal template: draw the header line once
The grey line under the header was drawn twice: LibreOffice writes two
identical fills (or strokes) for any paragraph border or shading, even for a
plain body paragraph outside a table (confirmed in the raw PDF stream). It is
now a line shape anchored to the page, added to the label paragraph (outside
the table; an anchor inside a cell follows the cell). One stroke, 1.0pt,
#888888, x 54.00 to 541.00, y 146.50, and it no longer needs the blank
paragraphs and conditional lines that kept the border in place.

test:render --pdf checks there is exactly one grey line on page 1 and none on
later pages, and the template has exactly one line shape (none for external).
pdf-measure.mjs also counts even-odd fills.

Co-Authored-By: Claude Sonnet 5.5 <noreply@anthropic.com>
</commit_message>
<xml_diff>
--- a/public/templates/internal.docx
+++ b/public/templates/internal.docx
@@ -30,6 +30,46 @@
           <w:rtl w:val="0"/>
         </w:rPr>
         <w:t xml:space="preserve">A PROUD MEMBER OF</w:t>
+      </w:r>
+      <w:r>
+        <w:drawing>
+          <wp:anchor distT="0" distB="0" distL="0" distR="0" simplePos="0" relativeHeight="2" behindDoc="0" locked="0" layoutInCell="0" allowOverlap="1">
+            <wp:simplePos x="0" y="0"/>
+            <wp:positionH relativeFrom="page">
+              <wp:posOffset>685800</wp:posOffset>
+            </wp:positionH>
+            <wp:positionV relativeFrom="page">
+              <wp:posOffset>1860550</wp:posOffset>
+            </wp:positionV>
+            <wp:extent cx="6184900" cy="0"/>
+            <wp:effectExtent l="0" t="0" r="0" b="0"/>
+            <wp:wrapNone/>
+            <wp:docPr id="102" name="header rule"/>
+            <wp:cNvGraphicFramePr/>
+            <a:graphic>
+              <a:graphicData uri="http://schemas.microsoft.com/office/word/2010/wordprocessingShape">
+                <wps:wsp>
+                  <wps:cNvCnPr/>
+                  <wps:spPr>
+                    <a:xfrm>
+                      <a:off x="0" y="0"/>
+                      <a:ext cx="6184900" cy="0"/>
+                    </a:xfrm>
+                    <a:prstGeom prst="line">
+                      <a:avLst/>
+                    </a:prstGeom>
+                    <a:ln w="12700">
+                      <a:solidFill>
+                        <a:srgbClr val="888888"/>
+                      </a:solidFill>
+                    </a:ln>
+                  </wps:spPr>
+                  <wps:bodyPr/>
+                </wps:wsp>
+              </a:graphicData>
+            </a:graphic>
+          </wp:anchor>
+        </w:drawing>
       </w:r>
     </w:p>
     <w:tbl>
@@ -231,22 +271,6 @@
           </w:p>
           <w:p>
             <w:r>
-              <w:t xml:space="preserve">{^hasExperienceSummary}</w:t>
-            </w:r>
-          </w:p>
-          <w:p>
-            <w:pPr>
-              <w:spacing w:before="0" w:after="0" w:line="332" w:lineRule="exact"/>
-              <w:jc w:val="left"/>
-            </w:pPr>
-          </w:p>
-          <w:p>
-            <w:r>
-              <w:t xml:space="preserve">{/hasExperienceSummary}</w:t>
-            </w:r>
-          </w:p>
-          <w:p>
-            <w:r>
               <w:t xml:space="preserve">{#hasSpecialization}</w:t>
             </w:r>
           </w:p>
@@ -279,32 +303,6 @@
             <w:r>
               <w:t xml:space="preserve">{/hasSpecialization}</w:t>
             </w:r>
-          </w:p>
-          <w:p>
-            <w:r>
-              <w:t xml:space="preserve">{^hasSpecialization}</w:t>
-            </w:r>
-          </w:p>
-          <w:p>
-            <w:pPr>
-              <w:spacing w:before="0" w:after="0" w:line="348" w:lineRule="exact"/>
-              <w:jc w:val="left"/>
-            </w:pPr>
-          </w:p>
-          <w:p>
-            <w:r>
-              <w:t xml:space="preserve">{/hasSpecialization}</w:t>
-            </w:r>
-          </w:p>
-          <w:p>
-            <w:pPr>
-              <w:pBdr>
-                <w:bottom w:val="single" w:sz="8" w:space="0" w:color="888888"/>
-              </w:pBdr>
-              <w:spacing w:before="0" w:after="0" w:line="154" w:lineRule="exact"/>
-              <w:ind w:left="66" w:right="376" w:firstLine="0"/>
-              <w:jc w:val="left"/>
-            </w:pPr>
           </w:p>
         </w:tc>
       </w:tr>

</xml_diff>